<commit_message>
DML Commands and diff btw Drop,Delete,Truncate
</commit_message>
<xml_diff>
--- a/Day-5.docx
+++ b/Day-5.docx
@@ -4,15 +4,20 @@
   <w:body>
     <w:p>
       <w:pPr>
+        <w:jc w:val="center"/>
         <w:rPr>
           <w:b/>
           <w:bCs/>
+          <w:sz w:val="32"/>
+          <w:szCs w:val="32"/>
         </w:rPr>
       </w:pPr>
       <w:r>
         <w:rPr>
           <w:b/>
           <w:bCs/>
+          <w:sz w:val="32"/>
+          <w:szCs w:val="32"/>
         </w:rPr>
         <w:t>Day-5</w:t>
       </w:r>
@@ -557,6 +562,7 @@
     </w:p>
     <w:p>
       <w:r>
+        <w:lastRenderedPageBreak/>
         <w:t>SELECT*FROM EMPLOYEES;</w:t>
       </w:r>
       <w:r>
@@ -565,9 +571,6 @@
       </w:r>
       <w:r>
         <w:br/>
-      </w:r>
-      <w:r>
-        <w:lastRenderedPageBreak/>
         <w:t>| E001  | MALLI     | ARJUN    |   27 | 2024-03-20 | HYD     | JAVA        |</w:t>
       </w:r>
       <w:r>
@@ -904,54 +907,267 @@
       </w:r>
       <w:r>
         <w:br/>
+      </w:r>
+      <w:r>
+        <w:lastRenderedPageBreak/>
         <w:t>--------</w:t>
       </w:r>
       <w:r>
         <w:br/>
+        <w:t>UPDATE TABLE-NAME SET COLUMN-NAME=VALUE WHERE CONDITION;</w:t>
+      </w:r>
+      <w:r>
+        <w:br/>
+        <w:t>UPDATE EMPLOYEES SET LASTNAME='KUMAR' WHERE FIRSTNAME='ARUN';</w:t>
+      </w:r>
+    </w:p>
+    <w:p>
+      <w:r>
+        <w:t>SELECT*FROM EMPLOYEES;</w:t>
+      </w:r>
+      <w:r>
+        <w:br/>
+        <w:t>| EMPID | FIRSTNAME | LASTNAME | AGE  | DOJ        | ADDRESS    | DEPT        |</w:t>
+      </w:r>
+      <w:r>
+        <w:br/>
+        <w:t>| E001  | MALLI     | ARJUN    |   27 | 2024-03-20 | HYD        | JAVA        |</w:t>
+      </w:r>
+      <w:r>
+        <w:br/>
+        <w:t>| E002  | ARJUN     | SARKAR   |   37 | 2022-02-20 | VJY        | SALES       |</w:t>
+      </w:r>
+      <w:r>
+        <w:br/>
+        <w:t>| E003  | SAI       | VARDAN   |   22 | 2024-03-18 | HYD        | PYTHON      |</w:t>
+      </w:r>
+      <w:r>
+        <w:br/>
+        <w:t>| E004  | SUMA      | SRI      |   24 | 2025-10-10 | BNG        | DEVELOPMENT |</w:t>
+      </w:r>
+      <w:r>
+        <w:br/>
+        <w:t>| E005  | MANI      | SHARMA   |   17 | 2020-09-09 | MUMBAI     | MARKETING   |</w:t>
+      </w:r>
+      <w:r>
+        <w:br/>
+        <w:t>| E006  | MOUNIKA   | KOPPU    |   27 | 2019-11-11 | PUNE       | FINANCE     |</w:t>
+      </w:r>
+      <w:r>
+        <w:br/>
+        <w:t xml:space="preserve">| e007  | </w:t>
+      </w:r>
+      <w:proofErr w:type="spellStart"/>
+      <w:r>
+        <w:t>sai</w:t>
+      </w:r>
+      <w:proofErr w:type="spellEnd"/>
+      <w:r>
+        <w:t xml:space="preserve">       | kiran    |   32 | 2018-09-12 | </w:t>
+      </w:r>
+      <w:proofErr w:type="spellStart"/>
+      <w:r>
+        <w:t>pune</w:t>
+      </w:r>
+      <w:proofErr w:type="spellEnd"/>
+      <w:r>
+        <w:t xml:space="preserve">       | admin       |</w:t>
+      </w:r>
+      <w:r>
+        <w:br/>
+        <w:t>| E008  | SAI       | RAM      | NULL | 2017-07-07 | VIJAYAWADA | NULL        |</w:t>
+      </w:r>
+      <w:r>
+        <w:br/>
+        <w:t>| E009  | ARUN      | KUMAR    |   15 | NULL       | DELHI      | TRAINEE     |</w:t>
+      </w:r>
+      <w:r>
+        <w:br/>
+        <w:t>| E010  | SUDHEER   | KUMAR    |   45 | 2024-06-01 | KOLKATTA   | DEVELOPMENT |</w:t>
+      </w:r>
+    </w:p>
+    <w:p>
+      <w:r>
+        <w:t>UPDATE EMPLOYEES SET AGE=47 WHERE EMPID='E008';</w:t>
+      </w:r>
+    </w:p>
+    <w:p>
+      <w:r>
+        <w:t>SELECT*FROM EMPLOYEES;</w:t>
+      </w:r>
+      <w:r>
+        <w:br/>
+        <w:t>| EMPID | FIRSTNAME | LASTNAME | AGE  | DOJ        | ADDRESS    | DEPT        |</w:t>
+      </w:r>
+      <w:r>
+        <w:br/>
+        <w:t>| E001  | MALLI     | ARJUN    |   27 | 2024-03-20 | HYD        | JAVA        |</w:t>
+      </w:r>
+      <w:r>
+        <w:br/>
+        <w:t>| E002  | ARJUN     | SARKAR   |   37 | 2022-02-20 | VJY        | SALES       |</w:t>
+      </w:r>
+      <w:r>
+        <w:br/>
+        <w:t>| E003  | SAI       | VARDAN   |   22 | 2024-03-18 | HYD        | PYTHON      |</w:t>
+      </w:r>
+      <w:r>
+        <w:br/>
+        <w:t>| E004  | SUMA      | SRI      |   24 | 2025-10-10 | BNG        | DEVELOPMENT |</w:t>
+      </w:r>
+      <w:r>
+        <w:br/>
+        <w:t>| E005  | MANI      | SHARMA   |   17 | 2020-09-09 | MUMBAI     | MARKETING   |</w:t>
+      </w:r>
+      <w:r>
+        <w:br/>
+        <w:t>| E006  | MOUNIKA   | KOPPU    |   27 | 2019-11-11 | PUNE       | FINANCE     |</w:t>
+      </w:r>
+      <w:r>
+        <w:br/>
+        <w:t xml:space="preserve">| e007  | </w:t>
+      </w:r>
+      <w:proofErr w:type="spellStart"/>
+      <w:r>
+        <w:t>sai</w:t>
+      </w:r>
+      <w:proofErr w:type="spellEnd"/>
+      <w:r>
+        <w:t xml:space="preserve">       | kiran    |   32 | 2018-09-12 | </w:t>
+      </w:r>
+      <w:proofErr w:type="spellStart"/>
+      <w:r>
+        <w:t>pune</w:t>
+      </w:r>
+      <w:proofErr w:type="spellEnd"/>
+      <w:r>
+        <w:t xml:space="preserve">       | admin       |</w:t>
+      </w:r>
+      <w:r>
+        <w:br/>
+        <w:t>| E008  | SAI       | RAM      |   47 | 2017-07-07 | VIJAYAWADA | NULL        |</w:t>
+      </w:r>
+      <w:r>
+        <w:br/>
+        <w:t>| E009  | ARUN      | KUMAR    |   15 | NULL       | DELHI      | TRAINEE     |</w:t>
+      </w:r>
+      <w:r>
+        <w:br/>
+        <w:t>| E010  | SUDHEER   | KUMAR    |   45 | 2024-06-01 | KOLKATTA   | DEVELOPMENT |</w:t>
+      </w:r>
+    </w:p>
+    <w:p>
+      <w:r>
+        <w:t>UPDATE EMPLOYEES SET DEPT='IT' WHERE ADDRESS='VIJAYAWADA';</w:t>
+      </w:r>
+    </w:p>
+    <w:p>
+      <w:r>
+        <w:t>SELECT*FROM EMPLOYEES;</w:t>
+      </w:r>
+      <w:r>
+        <w:br/>
+        <w:t>| EMPID | FIRSTNAME | LASTNAME | AGE  | DOJ        | ADDRESS    | DEPT        |</w:t>
+      </w:r>
+      <w:r>
+        <w:br/>
+        <w:t>| E001  | MALLI     | ARJUN    |   27 | 2024-03-20 | HYD        | JAVA        |</w:t>
+      </w:r>
+      <w:r>
+        <w:br/>
+        <w:t>| E002  | ARJUN     | SARKAR   |   37 | 2022-02-20 | VJY        | SALES       |</w:t>
+      </w:r>
+      <w:r>
+        <w:br/>
+        <w:t>| E003  | SAI       | VARDAN   |   22 | 2024-03-18 | HYD        | PYTHON      |</w:t>
+      </w:r>
+      <w:r>
+        <w:br/>
+        <w:t>| E004  | SUMA      | SRI      |   24 | 2025-10-10 | BNG        | DEVELOPMENT |</w:t>
+      </w:r>
+      <w:r>
+        <w:br/>
+        <w:t>| E005  | MANI      | SHARMA   |   17 | 2020-09-09 | MUMBAI     | MARKETING   |</w:t>
+      </w:r>
+      <w:r>
+        <w:br/>
+        <w:t>| E006  | MOUNIKA   | KOPPU    |   27 | 2019-11-11 | PUNE       | FINANCE     |</w:t>
+      </w:r>
+      <w:r>
+        <w:br/>
+        <w:t xml:space="preserve">| e007  | </w:t>
+      </w:r>
+      <w:proofErr w:type="spellStart"/>
+      <w:r>
+        <w:t>sai</w:t>
+      </w:r>
+      <w:proofErr w:type="spellEnd"/>
+      <w:r>
+        <w:t xml:space="preserve">       | kiran    |   32 | 2018-09-12 | </w:t>
+      </w:r>
+      <w:proofErr w:type="spellStart"/>
+      <w:r>
+        <w:t>pune</w:t>
+      </w:r>
+      <w:proofErr w:type="spellEnd"/>
+      <w:r>
+        <w:t xml:space="preserve">       | admin       |</w:t>
+      </w:r>
+      <w:r>
+        <w:br/>
+        <w:t>| E008  | SAI       | RAM      |   47 | 2017-07-07 | VIJAYAWADA | IT          |</w:t>
+      </w:r>
+      <w:r>
+        <w:br/>
+        <w:t>| E009  | ARUN      | KUMAR    |   15 | NULL       | DELHI      | TRAINEE     |</w:t>
+      </w:r>
+      <w:r>
+        <w:br/>
+        <w:t>| E010  | SUDHEER   | KUMAR    |   45 | 2024-06-01 | KOLKATTA   | DEVELOPMENT |</w:t>
+      </w:r>
+    </w:p>
+    <w:p>
+      <w:r>
+        <w:t>UPDATE EMPLOYEES SET DOJ='2026-06-27' WHERE EMPID='E009';</w:t>
+      </w:r>
+    </w:p>
+    <w:p>
+      <w:r>
+        <w:t>SELECT*FROM EMPLOYEES;</w:t>
+      </w:r>
+      <w:r>
+        <w:br/>
+        <w:t>| EMPID | FIRSTNAME | LASTNAME | AGE  | DOJ        | ADDRESS    | DEPT        |</w:t>
+      </w:r>
+      <w:r>
+        <w:br/>
+        <w:t>| E001  | MALLI     | ARJUN    |   27 | 2024-03-20 | HYD        | JAVA        |</w:t>
+      </w:r>
+      <w:r>
+        <w:br/>
+        <w:t>| E002  | ARJUN     | SARKAR   |   37 | 2022-02-20 | VJY        | SALES       |</w:t>
+      </w:r>
+      <w:r>
+        <w:br/>
+        <w:t>| E003  | SAI       | VARDAN   |   22 | 2024-03-18 | HYD        | PYTHON      |</w:t>
+      </w:r>
+      <w:r>
+        <w:br/>
+        <w:t>| E004  | SUMA      | SRI      |   24 | 2025-10-10 | BNG        | DEVELOPMENT |</w:t>
+      </w:r>
+      <w:r>
+        <w:br/>
+        <w:t>| E005  | MANI      | SHARMA   |   17 | 2020-09-09 | MUMBAI     | MARKETING   |</w:t>
+      </w:r>
+      <w:r>
+        <w:br/>
+        <w:t>| E006  | MOUNIKA   | KOPPU    |   27 | 2019-11-11 | PUNE       | FINANCE     |</w:t>
+      </w:r>
+      <w:r>
+        <w:br/>
       </w:r>
       <w:r>
         <w:lastRenderedPageBreak/>
-        <w:t>UPDATE TABLE-NAME SET COLUMN-NAME=VALUE WHERE CONDITION;</w:t>
-      </w:r>
-      <w:r>
-        <w:br/>
-        <w:t>UPDATE EMPLOYEES SET LASTNAME='KUMAR' WHERE FIRSTNAME='ARUN';</w:t>
-      </w:r>
-    </w:p>
-    <w:p>
-      <w:r>
-        <w:t>SELECT*FROM EMPLOYEES;</w:t>
-      </w:r>
-      <w:r>
-        <w:br/>
-        <w:t>| EMPID | FIRSTNAME | LASTNAME | AGE  | DOJ        | ADDRESS    | DEPT        |</w:t>
-      </w:r>
-      <w:r>
-        <w:br/>
-        <w:t>| E001  | MALLI     | ARJUN    |   27 | 2024-03-20 | HYD        | JAVA        |</w:t>
-      </w:r>
-      <w:r>
-        <w:br/>
-        <w:t>| E002  | ARJUN     | SARKAR   |   37 | 2022-02-20 | VJY        | SALES       |</w:t>
-      </w:r>
-      <w:r>
-        <w:br/>
-        <w:t>| E003  | SAI       | VARDAN   |   22 | 2024-03-18 | HYD        | PYTHON      |</w:t>
-      </w:r>
-      <w:r>
-        <w:br/>
-        <w:t>| E004  | SUMA      | SRI      |   24 | 2025-10-10 | BNG        | DEVELOPMENT |</w:t>
-      </w:r>
-      <w:r>
-        <w:br/>
-        <w:t>| E005  | MANI      | SHARMA   |   17 | 2020-09-09 | MUMBAI     | MARKETING   |</w:t>
-      </w:r>
-      <w:r>
-        <w:br/>
-        <w:t>| E006  | MOUNIKA   | KOPPU    |   27 | 2019-11-11 | PUNE       | FINANCE     |</w:t>
-      </w:r>
-      <w:r>
-        <w:br/>
         <w:t xml:space="preserve">| e007  | </w:t>
       </w:r>
       <w:proofErr w:type="spellStart"/>
@@ -972,219 +1188,6 @@
       </w:r>
       <w:r>
         <w:br/>
-        <w:t>| E008  | SAI       | RAM      | NULL | 2017-07-07 | VIJAYAWADA | NULL        |</w:t>
-      </w:r>
-      <w:r>
-        <w:br/>
-        <w:t>| E009  | ARUN      | KUMAR    |   15 | NULL       | DELHI      | TRAINEE     |</w:t>
-      </w:r>
-      <w:r>
-        <w:br/>
-        <w:t>| E010  | SUDHEER   | KUMAR    |   45 | 2024-06-01 | KOLKATTA   | DEVELOPMENT |</w:t>
-      </w:r>
-    </w:p>
-    <w:p>
-      <w:r>
-        <w:t>UPDATE EMPLOYEES SET AGE=47 WHERE EMPID='E008';</w:t>
-      </w:r>
-    </w:p>
-    <w:p>
-      <w:r>
-        <w:t>SELECT*FROM EMPLOYEES;</w:t>
-      </w:r>
-      <w:r>
-        <w:br/>
-        <w:t>| EMPID | FIRSTNAME | LASTNAME | AGE  | DOJ        | ADDRESS    | DEPT        |</w:t>
-      </w:r>
-      <w:r>
-        <w:br/>
-        <w:t>| E001  | MALLI     | ARJUN    |   27 | 2024-03-20 | HYD        | JAVA        |</w:t>
-      </w:r>
-      <w:r>
-        <w:br/>
-        <w:t>| E002  | ARJUN     | SARKAR   |   37 | 2022-02-20 | VJY        | SALES       |</w:t>
-      </w:r>
-      <w:r>
-        <w:br/>
-        <w:t>| E003  | SAI       | VARDAN   |   22 | 2024-03-18 | HYD        | PYTHON      |</w:t>
-      </w:r>
-      <w:r>
-        <w:br/>
-        <w:t>| E004  | SUMA      | SRI      |   24 | 2025-10-10 | BNG        | DEVELOPMENT |</w:t>
-      </w:r>
-      <w:r>
-        <w:br/>
-        <w:t>| E005  | MANI      | SHARMA   |   17 | 2020-09-09 | MUMBAI     | MARKETING   |</w:t>
-      </w:r>
-      <w:r>
-        <w:br/>
-        <w:t>| E006  | MOUNIKA   | KOPPU    |   27 | 2019-11-11 | PUNE       | FINANCE     |</w:t>
-      </w:r>
-      <w:r>
-        <w:br/>
-        <w:t xml:space="preserve">| e007  | </w:t>
-      </w:r>
-      <w:proofErr w:type="spellStart"/>
-      <w:r>
-        <w:t>sai</w:t>
-      </w:r>
-      <w:proofErr w:type="spellEnd"/>
-      <w:r>
-        <w:t xml:space="preserve">       | kiran    |   32 | 2018-09-12 | </w:t>
-      </w:r>
-      <w:proofErr w:type="spellStart"/>
-      <w:r>
-        <w:t>pune</w:t>
-      </w:r>
-      <w:proofErr w:type="spellEnd"/>
-      <w:r>
-        <w:t xml:space="preserve">       | admin       |</w:t>
-      </w:r>
-      <w:r>
-        <w:br/>
-        <w:t>| E008  | SAI       | RAM      |   47 | 2017-07-07 | VIJAYAWADA | NULL        |</w:t>
-      </w:r>
-      <w:r>
-        <w:br/>
-        <w:t>| E009  | ARUN      | KUMAR    |   15 | NULL       | DELHI      | TRAINEE     |</w:t>
-      </w:r>
-      <w:r>
-        <w:br/>
-        <w:t>| E010  | SUDHEER   | KUMAR    |   45 | 2024-06-01 | KOLKATTA   | DEVELOPMENT |</w:t>
-      </w:r>
-    </w:p>
-    <w:p>
-      <w:r>
-        <w:t>UPDATE EMPLOYEES SET DEPT='IT' WHERE ADDRESS='VIJAYAWADA';</w:t>
-      </w:r>
-    </w:p>
-    <w:p>
-      <w:r>
-        <w:t>SELECT*FROM EMPLOYEES;</w:t>
-      </w:r>
-      <w:r>
-        <w:br/>
-        <w:t>| EMPID | FIRSTNAME | LASTNAME | AGE  | DOJ        | ADDRESS    | DEPT        |</w:t>
-      </w:r>
-      <w:r>
-        <w:br/>
-        <w:t>| E001  | MALLI     | ARJUN    |   27 | 2024-03-20 | HYD        | JAVA        |</w:t>
-      </w:r>
-      <w:r>
-        <w:br/>
-        <w:t>| E002  | ARJUN     | SARKAR   |   37 | 2022-02-20 | VJY        | SALES       |</w:t>
-      </w:r>
-      <w:r>
-        <w:br/>
-        <w:t>| E003  | SAI       | VARDAN   |   22 | 2024-03-18 | HYD        | PYTHON      |</w:t>
-      </w:r>
-      <w:r>
-        <w:br/>
-        <w:t>| E004  | SUMA      | SRI      |   24 | 2025-10-10 | BNG        | DEVELOPMENT |</w:t>
-      </w:r>
-      <w:r>
-        <w:br/>
-        <w:t>| E005  | MANI      | SHARMA   |   17 | 2020-09-09 | MUMBAI     | MARKETING   |</w:t>
-      </w:r>
-      <w:r>
-        <w:br/>
-        <w:t>| E006  | MOUNIKA   | KOPPU    |   27 | 2019-11-11 | PUNE       | FINANCE     |</w:t>
-      </w:r>
-      <w:r>
-        <w:br/>
-        <w:t xml:space="preserve">| e007  | </w:t>
-      </w:r>
-      <w:proofErr w:type="spellStart"/>
-      <w:r>
-        <w:t>sai</w:t>
-      </w:r>
-      <w:proofErr w:type="spellEnd"/>
-      <w:r>
-        <w:t xml:space="preserve">       | kiran    |   32 | 2018-09-12 | </w:t>
-      </w:r>
-      <w:proofErr w:type="spellStart"/>
-      <w:r>
-        <w:t>pune</w:t>
-      </w:r>
-      <w:proofErr w:type="spellEnd"/>
-      <w:r>
-        <w:t xml:space="preserve">       | admin       |</w:t>
-      </w:r>
-      <w:r>
-        <w:br/>
-        <w:t>| E008  | SAI       | RAM      |   47 | 2017-07-07 | VIJAYAWADA | IT          |</w:t>
-      </w:r>
-      <w:r>
-        <w:br/>
-        <w:t>| E009  | ARUN      | KUMAR    |   15 | NULL       | DELHI      | TRAINEE     |</w:t>
-      </w:r>
-      <w:r>
-        <w:br/>
-        <w:t>| E010  | SUDHEER   | KUMAR    |   45 | 2024-06-01 | KOLKATTA   | DEVELOPMENT |</w:t>
-      </w:r>
-    </w:p>
-    <w:p>
-      <w:r>
-        <w:t>UPDATE EMPLOYEES SET DOJ='2026-06-27' WHERE EMPID='E009';</w:t>
-      </w:r>
-    </w:p>
-    <w:p>
-      <w:r>
-        <w:t>SELECT*FROM EMPLOYEES;</w:t>
-      </w:r>
-      <w:r>
-        <w:br/>
-        <w:t>| EMPID | FIRSTNAME | LASTNAME | AGE  | DOJ        | ADDRESS    | DEPT        |</w:t>
-      </w:r>
-      <w:r>
-        <w:br/>
-        <w:t>| E001  | MALLI     | ARJUN    |   27 | 2024-03-20 | HYD        | JAVA        |</w:t>
-      </w:r>
-      <w:r>
-        <w:br/>
-        <w:t>| E002  | ARJUN     | SARKAR   |   37 | 2022-02-20 | VJY        | SALES       |</w:t>
-      </w:r>
-      <w:r>
-        <w:br/>
-        <w:t>| E003  | SAI       | VARDAN   |   22 | 2024-03-18 | HYD        | PYTHON      |</w:t>
-      </w:r>
-      <w:r>
-        <w:br/>
-        <w:t>| E004  | SUMA      | SRI      |   24 | 2025-10-10 | BNG        | DEVELOPMENT |</w:t>
-      </w:r>
-      <w:r>
-        <w:br/>
-        <w:t>| E005  | MANI      | SHARMA   |   17 | 2020-09-09 | MUMBAI     | MARKETING   |</w:t>
-      </w:r>
-      <w:r>
-        <w:br/>
-        <w:t>| E006  | MOUNIKA   | KOPPU    |   27 | 2019-11-11 | PUNE       | FINANCE     |</w:t>
-      </w:r>
-      <w:r>
-        <w:br/>
-        <w:t xml:space="preserve">| e007  | </w:t>
-      </w:r>
-      <w:proofErr w:type="spellStart"/>
-      <w:r>
-        <w:t>sai</w:t>
-      </w:r>
-      <w:proofErr w:type="spellEnd"/>
-      <w:r>
-        <w:t xml:space="preserve">       | kiran    |   32 | 2018-09-12 | </w:t>
-      </w:r>
-      <w:proofErr w:type="spellStart"/>
-      <w:r>
-        <w:t>pune</w:t>
-      </w:r>
-      <w:proofErr w:type="spellEnd"/>
-      <w:r>
-        <w:t xml:space="preserve">       | admin       |</w:t>
-      </w:r>
-      <w:r>
-        <w:br/>
-      </w:r>
-      <w:r>
-        <w:lastRenderedPageBreak/>
         <w:t>| E008  | SAI       | RAM      |   47 | 2017-07-07 | VIJAYAWADA | IT          |</w:t>
       </w:r>
       <w:r>
@@ -1480,6 +1483,7 @@
     </w:p>
     <w:p>
       <w:r>
+        <w:lastRenderedPageBreak/>
         <w:t>Delete</w:t>
       </w:r>
       <w:r>
@@ -1499,7 +1503,6 @@
           <w:b/>
           <w:bCs/>
         </w:rPr>
-        <w:lastRenderedPageBreak/>
         <w:t>Step-by-Step Example in MySQL:</w:t>
       </w:r>
     </w:p>
@@ -1806,6 +1809,7 @@
     </w:p>
     <w:p>
       <w:r>
+        <w:lastRenderedPageBreak/>
         <w:t>In MySQL, TRUNCATE is a DDL (Data Definition Language) operation, not a DML (Data Manipulation Language) operation. This means it cannot be rolled back in MySQL.</w:t>
       </w:r>
       <w:r>
@@ -1819,7 +1823,6 @@
     </w:p>
     <w:p>
       <w:r>
-        <w:lastRenderedPageBreak/>
         <w:t>-- Perform TRUNCATE operation (remove all rows from the table)</w:t>
       </w:r>
       <w:r>
@@ -2057,6 +2060,7 @@
         </w:numPr>
       </w:pPr>
       <w:r>
+        <w:lastRenderedPageBreak/>
         <w:t>TRUNCATE: Cannot be rolled back in MySQL (it’s treated as a DDL command).</w:t>
       </w:r>
     </w:p>
@@ -2073,13 +2077,149 @@
     </w:p>
     <w:p>
       <w:r>
+        <w:t>To safely perform actions that can be rolled back in MySQL, you should rely on DELETE within transactions. TRUNCATE and DROP are permanent changes in MySQL and cannot be undone unless you have backups or restore points.</w:t>
+      </w:r>
+    </w:p>
+    <w:p/>
+    <w:p>
+      <w:r>
+        <w:t>Key Differences Summary:</w:t>
+      </w:r>
+    </w:p>
+    <w:p/>
+    <w:p>
+      <w:r>
+        <w:t>Action</w:t>
+      </w:r>
+    </w:p>
+    <w:p/>
+    <w:p>
+      <w:r>
+        <w:t>DROP Removes the table or object</w:t>
+      </w:r>
+    </w:p>
+    <w:p>
+      <w:r>
+        <w:t>DELETE Removes specific rows from a table</w:t>
+      </w:r>
+    </w:p>
+    <w:p>
+      <w:r>
+        <w:t>TRUNCATE Removes all rows, keeps structure</w:t>
+      </w:r>
+    </w:p>
+    <w:p/>
+    <w:p>
+      <w:r>
+        <w:t>Data Removed</w:t>
+      </w:r>
+    </w:p>
+    <w:p/>
+    <w:p>
+      <w:r>
+        <w:t>DROP Table structure + data</w:t>
+      </w:r>
+    </w:p>
+    <w:p>
+      <w:r>
+        <w:t>DELETE Specific rows (based on WHERE)</w:t>
+      </w:r>
+    </w:p>
+    <w:p>
+      <w:r>
+        <w:t>TRUNCATE All rows</w:t>
+      </w:r>
+    </w:p>
+    <w:p/>
+    <w:p>
+      <w:r>
+        <w:t>Table Structure</w:t>
+      </w:r>
+    </w:p>
+    <w:p/>
+    <w:p>
+      <w:r>
+        <w:t>DROP Removed</w:t>
+      </w:r>
+    </w:p>
+    <w:p>
+      <w:r>
+        <w:t>DELETE Intact</w:t>
+      </w:r>
+    </w:p>
+    <w:p>
+      <w:r>
+        <w:t>TRUNCATE Intact</w:t>
+      </w:r>
+    </w:p>
+    <w:p/>
+    <w:p>
+      <w:r>
+        <w:t>Performance</w:t>
+      </w:r>
+    </w:p>
+    <w:p/>
+    <w:p>
+      <w:r>
+        <w:t>DROP Slow (due to full removal)</w:t>
+      </w:r>
+    </w:p>
+    <w:p>
+      <w:r>
+        <w:t>DELETE Slower (row-by-row)</w:t>
+      </w:r>
+    </w:p>
+    <w:p>
+      <w:r>
+        <w:t>TRUNCATE Fast (bulk deletion)</w:t>
+      </w:r>
+    </w:p>
+    <w:p/>
+    <w:p>
+      <w:r>
+        <w:t>Rollback</w:t>
+      </w:r>
+    </w:p>
+    <w:p/>
+    <w:p>
+      <w:r>
+        <w:t>DROP No (unless in transaction)</w:t>
+      </w:r>
+    </w:p>
+    <w:p>
+      <w:r>
+        <w:t>DELETE Yes</w:t>
+      </w:r>
+    </w:p>
+    <w:p>
+      <w:r>
         <w:lastRenderedPageBreak/>
-        <w:t>To safely perform actions that can be rolled back in MySQL, you should rely on DELETE within transactions. TRUNCATE and DROP are permanent changes in MySQL and cannot be undone unless you have backups or restore points.</w:t>
+        <w:t>TRUNCATE Yes (if in transaction, varies by DB)</w:t>
       </w:r>
     </w:p>
     <w:p/>
     <w:p>
       <w:r>
+        <w:t>Auto-Increment Reset</w:t>
+      </w:r>
+    </w:p>
+    <w:p>
+      <w:r>
+        <w:t>N/A</w:t>
+      </w:r>
+    </w:p>
+    <w:p>
+      <w:r>
+        <w:t>No</w:t>
+      </w:r>
+    </w:p>
+    <w:p>
+      <w:r>
+        <w:t>Yes (depending on DB)</w:t>
+      </w:r>
+    </w:p>
+    <w:p>
+      <w:r>
         <w:t>Key Differences Summary:</w:t>
       </w:r>
     </w:p>
@@ -2185,143 +2325,7 @@
     </w:p>
     <w:p>
       <w:r>
-        <w:t>DELETE Yes</w:t>
-      </w:r>
-    </w:p>
-    <w:p>
-      <w:r>
-        <w:t>TRUNCATE Yes (if in transaction, varies by DB)</w:t>
-      </w:r>
-    </w:p>
-    <w:p/>
-    <w:p>
-      <w:r>
         <w:lastRenderedPageBreak/>
-        <w:t>Auto-Increment Reset</w:t>
-      </w:r>
-    </w:p>
-    <w:p>
-      <w:r>
-        <w:t>N/A</w:t>
-      </w:r>
-    </w:p>
-    <w:p>
-      <w:r>
-        <w:t>No</w:t>
-      </w:r>
-    </w:p>
-    <w:p>
-      <w:r>
-        <w:t>Yes (depending on DB)</w:t>
-      </w:r>
-    </w:p>
-    <w:p>
-      <w:r>
-        <w:t>Key Differences Summary:</w:t>
-      </w:r>
-    </w:p>
-    <w:p/>
-    <w:p>
-      <w:r>
-        <w:t>Action</w:t>
-      </w:r>
-    </w:p>
-    <w:p/>
-    <w:p>
-      <w:r>
-        <w:t>DROP Removes the table or object</w:t>
-      </w:r>
-    </w:p>
-    <w:p>
-      <w:r>
-        <w:t>DELETE Removes specific rows from a table</w:t>
-      </w:r>
-    </w:p>
-    <w:p>
-      <w:r>
-        <w:t>TRUNCATE Removes all rows, keeps structure</w:t>
-      </w:r>
-    </w:p>
-    <w:p/>
-    <w:p>
-      <w:r>
-        <w:t>Data Removed</w:t>
-      </w:r>
-    </w:p>
-    <w:p/>
-    <w:p>
-      <w:r>
-        <w:t>DROP Table structure + data</w:t>
-      </w:r>
-    </w:p>
-    <w:p>
-      <w:r>
-        <w:t>DELETE Specific rows (based on WHERE)</w:t>
-      </w:r>
-    </w:p>
-    <w:p>
-      <w:r>
-        <w:t>TRUNCATE All rows</w:t>
-      </w:r>
-    </w:p>
-    <w:p/>
-    <w:p>
-      <w:r>
-        <w:t>Table Structure</w:t>
-      </w:r>
-    </w:p>
-    <w:p/>
-    <w:p>
-      <w:r>
-        <w:t>DROP Removed</w:t>
-      </w:r>
-    </w:p>
-    <w:p>
-      <w:r>
-        <w:t>DELETE Intact</w:t>
-      </w:r>
-    </w:p>
-    <w:p>
-      <w:r>
-        <w:t>TRUNCATE Intact</w:t>
-      </w:r>
-    </w:p>
-    <w:p/>
-    <w:p>
-      <w:r>
-        <w:t>Performance</w:t>
-      </w:r>
-    </w:p>
-    <w:p/>
-    <w:p>
-      <w:r>
-        <w:t>DROP Slow (due to full removal)</w:t>
-      </w:r>
-    </w:p>
-    <w:p>
-      <w:r>
-        <w:t>DELETE Slower (row-by-row)</w:t>
-      </w:r>
-    </w:p>
-    <w:p>
-      <w:r>
-        <w:t>TRUNCATE Fast (bulk deletion)</w:t>
-      </w:r>
-    </w:p>
-    <w:p/>
-    <w:p>
-      <w:r>
-        <w:t>Rollback</w:t>
-      </w:r>
-    </w:p>
-    <w:p/>
-    <w:p>
-      <w:r>
-        <w:t>DROP No (unless in transaction)</w:t>
-      </w:r>
-    </w:p>
-    <w:p>
-      <w:r>
         <w:t>DELETE Yes</w:t>
       </w:r>
     </w:p>
@@ -3892,6 +3896,7 @@
   <w:style w:type="character" w:default="1" w:styleId="DefaultParagraphFont">
     <w:name w:val="Default Paragraph Font"/>
     <w:uiPriority w:val="1"/>
+    <w:semiHidden/>
     <w:unhideWhenUsed/>
   </w:style>
   <w:style w:type="table" w:default="1" w:styleId="TableNormal">

</xml_diff>